<commit_message>
docs: portada simplificada (sin MINTIC header ni CONFIDENCIAL)
</commit_message>
<xml_diff>
--- a/docs/Informe_Tecnico_MINTIC.docx
+++ b/docs/Informe_Tecnico_MINTIC.docx
@@ -2,6 +2,11 @@
 <file path=word/document.xml><?xml version="1.0" encoding="utf-8"?>
 <w:document xmlns:wpc="http://schemas.microsoft.com/office/word/2010/wordprocessingCanvas" xmlns:mc="http://schemas.openxmlformats.org/markup-compatibility/2006" xmlns:o="urn:schemas-microsoft-com:office:office" xmlns:r="http://schemas.openxmlformats.org/officeDocument/2006/relationships" xmlns:m="http://schemas.openxmlformats.org/officeDocument/2006/math" xmlns:v="urn:schemas-microsoft-com:vml" xmlns:wp14="http://schemas.microsoft.com/office/word/2010/wordprocessingDrawing" xmlns:wp="http://schemas.openxmlformats.org/drawingml/2006/wordprocessingDrawing" xmlns:w10="urn:schemas-microsoft-com:office:word" xmlns:w="http://schemas.openxmlformats.org/wordprocessingml/2006/main" xmlns:w14="http://schemas.microsoft.com/office/word/2010/wordml" xmlns:w15="http://schemas.microsoft.com/office/word/2012/wordml" xmlns:wpg="http://schemas.microsoft.com/office/word/2010/wordprocessingGroup" xmlns:wpi="http://schemas.microsoft.com/office/word/2010/wordprocessingInk" xmlns:wne="http://schemas.microsoft.com/office/word/2006/wordml" xmlns:wps="http://schemas.microsoft.com/office/word/2010/wordprocessingShape" xmlns:cx="http://schemas.microsoft.com/office/drawing/2014/chartex" xmlns:cx1="http://schemas.microsoft.com/office/drawing/2015/9/8/chartex" xmlns:cx2="http://schemas.microsoft.com/office/drawing/2015/10/21/chartex" xmlns:cx3="http://schemas.microsoft.com/office/drawing/2016/5/9/chartex" xmlns:cx4="http://schemas.microsoft.com/office/drawing/2016/5/10/chartex" xmlns:cx5="http://schemas.microsoft.com/office/drawing/2016/5/11/chartex" xmlns:cx6="http://schemas.microsoft.com/office/drawing/2016/5/12/chartex" xmlns:cx7="http://schemas.microsoft.com/office/drawing/2016/5/13/chartex" xmlns:cx8="http://schemas.microsoft.com/office/drawing/2016/5/14/chartex" xmlns:aink="http://schemas.microsoft.com/office/drawing/2016/ink" xmlns:am3d="http://schemas.microsoft.com/office/drawing/2017/model3d" xmlns:w16cex="http://schemas.microsoft.com/office/word/2018/wordml/cex" xmlns:w16cid="http://schemas.microsoft.com/office/word/2016/wordml/cid" xmlns:w16="http://schemas.microsoft.com/office/word/2018/wordml" xmlns:w16sdtdh="http://schemas.microsoft.com/office/word/2020/wordml/sdtdatahash" xmlns:w16se="http://schemas.microsoft.com/office/word/2015/wordml/symex" mc:Ignorable="w14 w15 wp14">
   <w:body>
+    <w:p>
+      <w:pPr>
+        <w:spacing w:after="80" w:before="80"/>
+      </w:pPr>
+    </w:p>
     <w:p>
       <w:pPr>
         <w:spacing w:after="80" w:before="80"/>
@@ -28,62 +33,15 @@
           <w:b/>
           <w:bCs/>
           <w:color w:val="1B3A6B"/>
-          <w:sz w:val="48"/>
-          <w:szCs w:val="48"/>
-        </w:rPr>
-        <w:t xml:space="preserve">MINTIC</w:t>
-      </w:r>
-    </w:p>
-    <w:p>
-      <w:pPr>
-        <w:spacing w:after="80" w:before="0"/>
-        <w:jc w:val="center"/>
-      </w:pPr>
-      <w:r>
-        <w:rPr>
-          <w:rFonts w:ascii="Calibri" w:cs="Calibri" w:eastAsia="Calibri" w:hAnsi="Calibri"/>
-          <w:i/>
-          <w:iCs/>
-          <w:color w:val="0D7E3C"/>
-          <w:sz w:val="24"/>
-          <w:szCs w:val="24"/>
-        </w:rPr>
-        <w:t xml:space="preserve">Programa Conecta Región Caribe</w:t>
-      </w:r>
-    </w:p>
-    <w:p>
-      <w:pPr>
-        <w:pBdr>
-          <w:bottom w:val="single" w:color="CCCCCC" w:sz="4"/>
-        </w:pBdr>
-        <w:spacing w:after="120" w:before="120"/>
-      </w:pPr>
-    </w:p>
-    <w:p>
-      <w:pPr>
-        <w:spacing w:after="80" w:before="80"/>
-      </w:pPr>
-    </w:p>
-    <w:p>
-      <w:pPr>
-        <w:spacing w:after="160" w:before="160"/>
-        <w:jc w:val="center"/>
-      </w:pPr>
-      <w:r>
-        <w:rPr>
-          <w:rFonts w:ascii="Calibri" w:cs="Calibri" w:eastAsia="Calibri" w:hAnsi="Calibri"/>
-          <w:b/>
-          <w:bCs/>
-          <w:color w:val="1B3A6B"/>
-          <w:sz w:val="40"/>
-          <w:szCs w:val="40"/>
+          <w:sz w:val="44"/>
+          <w:szCs w:val="44"/>
         </w:rPr>
         <w:t xml:space="preserve">Informe Técnico</w:t>
       </w:r>
     </w:p>
     <w:p>
       <w:pPr>
-        <w:spacing w:after="320" w:before="0"/>
+        <w:spacing w:after="480" w:before="0"/>
         <w:jc w:val="center"/>
       </w:pPr>
       <w:r>
@@ -100,7 +58,10 @@
     </w:p>
     <w:p>
       <w:pPr>
-        <w:spacing w:after="80" w:before="80"/>
+        <w:pBdr>
+          <w:bottom w:val="single" w:color="CCCCCC" w:sz="4"/>
+        </w:pBdr>
+        <w:spacing w:after="120" w:before="120"/>
       </w:pPr>
     </w:p>
     <w:p>
@@ -110,7 +71,7 @@
     </w:p>
     <w:p>
       <w:pPr>
-        <w:spacing w:after="60" w:before="60"/>
+        <w:spacing w:after="80" w:before="80"/>
         <w:jc w:val="center"/>
       </w:pPr>
       <w:r>
@@ -136,7 +97,7 @@
     </w:p>
     <w:p>
       <w:pPr>
-        <w:spacing w:after="60" w:before="60"/>
+        <w:spacing w:after="80" w:before="80"/>
         <w:jc w:val="center"/>
       </w:pPr>
       <w:r>
@@ -162,7 +123,7 @@
     </w:p>
     <w:p>
       <w:pPr>
-        <w:spacing w:after="60" w:before="60"/>
+        <w:spacing w:after="80" w:before="80"/>
         <w:jc w:val="center"/>
       </w:pPr>
       <w:r>
@@ -184,41 +145,6 @@
           <w:szCs w:val="20"/>
         </w:rPr>
         <w:t xml:space="preserve">Técnico — Uso interno</w:t>
-      </w:r>
-    </w:p>
-    <w:p>
-      <w:pPr>
-        <w:spacing w:after="80" w:before="80"/>
-      </w:pPr>
-    </w:p>
-    <w:p>
-      <w:pPr>
-        <w:spacing w:after="80" w:before="80"/>
-      </w:pPr>
-    </w:p>
-    <w:p>
-      <w:pPr>
-        <w:pBdr>
-          <w:bottom w:val="single" w:color="CCCCCC" w:sz="4"/>
-        </w:pBdr>
-        <w:spacing w:after="120" w:before="120"/>
-      </w:pPr>
-    </w:p>
-    <w:p>
-      <w:pPr>
-        <w:spacing w:after="0" w:before="80"/>
-        <w:jc w:val="center"/>
-      </w:pPr>
-      <w:r>
-        <w:rPr>
-          <w:rFonts w:ascii="Calibri" w:cs="Calibri" w:eastAsia="Calibri" w:hAnsi="Calibri"/>
-          <w:b/>
-          <w:bCs/>
-          <w:color w:val="C0392B"/>
-          <w:sz w:val="18"/>
-          <w:szCs w:val="18"/>
-        </w:rPr>
-        <w:t xml:space="preserve">CONFIDENCIAL — Uso exclusivo del equipo técnico evaluador</w:t>
       </w:r>
     </w:p>
     <w:p>
@@ -8559,7 +8485,7 @@
           <w:sz w:val="20"/>
           <w:szCs w:val="20"/>
         </w:rPr>
-        <w:t xml:space="preserve">Documento generado para evaluación técnica — MINTIC Programa Conecta Región Caribe — Abril 2026</w:t>
+        <w:t xml:space="preserve">Informe Técnico — MINTIC — Abril 2026</w:t>
       </w:r>
     </w:p>
     <w:sectPr>

</xml_diff>